<commit_message>
fix: bigger fonts, human-written PPT content, clean team roster, no personal email
</commit_message>
<xml_diff>
--- a/LangAI3.0_AI_Disclosure.docx
+++ b/LangAI3.0_AI_Disclosure.docx
@@ -42,12 +42,12 @@
     </w:p>
     <w:p>
       <w:r>
-        <w:t>Organization / Institution (if any): Thapar Institute of Engineering and Technology (TIET), Patiala</w:t>
+        <w:t>Organization / Institution: Thapar Institute of Engineering and Technology (TIET), Patiala</w:t>
       </w:r>
     </w:p>
     <w:p>
       <w:r>
-        <w:t>Submission Date: October 2026</w:t>
+        <w:t>Submission Date: September 2026</w:t>
       </w:r>
     </w:p>
     <w:p/>
@@ -65,12 +65,12 @@
     </w:p>
     <w:p>
       <w:r>
-        <w:t>Did your team use any Artificial Intelligence (AI) in developing this project?  YES</w:t>
+        <w:t>Did your team use any AI in developing this project?  YES</w:t>
       </w:r>
     </w:p>
     <w:p>
       <w:r>
-        <w:t>AI was leveraged as an interactive pair-programming and design accelerator.</w:t>
+        <w:t>AI was used as a pair-programming and design accelerator.</w:t>
       </w:r>
     </w:p>
     <w:p/>
@@ -125,37 +125,37 @@
     </w:p>
     <w:p>
       <w:r>
-        <w:t>Idea generation / brainstorming: Formulating hybrid neuro-symbolic retrieval strategies.</w:t>
+        <w:t>Idea generation: Formulating the hybrid neuro-symbolic retrieval approach.</w:t>
       </w:r>
     </w:p>
     <w:p>
       <w:r>
-        <w:t>Code generation or assistance: Scaffolding Tree-sitter AST visitor patterns and UI glassmorphism styles.</w:t>
+        <w:t>Code assistance: Scaffolding Tree-sitter visitor patterns and UI styles.</w:t>
       </w:r>
     </w:p>
     <w:p>
       <w:r>
-        <w:t>UI / UX design: Modern dark-mode glassmorphic theme and SVG graph layout.</w:t>
+        <w:t>UI/UX: Dark-mode glassmorphic layout and SVG graph.</w:t>
       </w:r>
     </w:p>
     <w:p>
       <w:r>
-        <w:t>Content creation: Generating realistic sample voice assistant test queries and edge cases.</w:t>
+        <w:t>Content: Generating realistic voice-assistant test queries for evaluation.</w:t>
       </w:r>
     </w:p>
     <w:p>
       <w:r>
-        <w:t>Data analysis: Calculating evaluation metrics (Precision@k, Mean Recall, Latency distributions).</w:t>
+        <w:t>Data analysis: Computing Precision@k, Recall, and latency metrics.</w:t>
       </w:r>
     </w:p>
     <w:p>
       <w:r>
-        <w:t>Testing / debugging: Pytest test suite generation and edge-case validation.</w:t>
+        <w:t>Testing: Pytest suite generation and edge-case validation.</w:t>
       </w:r>
     </w:p>
     <w:p>
       <w:r>
-        <w:t>Other: Documentation formatting and benchmark reporting.</w:t>
+        <w:t>Other: Documentation formatting.</w:t>
       </w:r>
     </w:p>
     <w:p/>
@@ -206,7 +206,7 @@
     </w:p>
     <w:p>
       <w:r>
-        <w:t>AI was leveraged as an interactive pair-programming and design accelerator.</w:t>
+        <w:t>AI was used as a pair-programming and design accelerator.</w:t>
       </w:r>
     </w:p>
     <w:p/>
@@ -223,7 +223,7 @@
     </w:p>
     <w:p>
       <w:r>
-        <w:t>AI was leveraged as an interactive pair-programming and design accelerator.</w:t>
+        <w:t>AI was used as a pair-programming and design accelerator.</w:t>
       </w:r>
     </w:p>
     <w:p>
@@ -323,7 +323,7 @@
     </w:p>
     <w:p>
       <w:r>
-        <w:t>Date: October 2026</w:t>
+        <w:t>Date: September 2026</w:t>
       </w:r>
     </w:p>
     <w:p/>
@@ -332,7 +332,7 @@
         <w:pStyle w:val="Heading2"/>
       </w:pPr>
       <w:r>
-        <w:t>Detailed Feature Origin Classification</w:t>
+        <w:t>Feature Origin</w:t>
       </w:r>
     </w:p>
     <w:p>
@@ -340,15 +340,15 @@
         <w:rPr>
           <w:b/>
         </w:rPr>
-        <w:t>• Feature: Tree-sitter AST &amp; Code Property Graph (CPG)</w:t>
+        <w:t>• Tree-sitter AST + Code Property Graph</w:t>
         <w:br/>
       </w:r>
       <w:r>
-        <w:t xml:space="preserve">  Origin: Both (Collaborative)</w:t>
+        <w:t xml:space="preserve">  Origin: Both (team + AI)</w:t>
         <w:br/>
       </w:r>
       <w:r>
-        <w:t xml:space="preserve">  Description: AI assisted with Tree-sitter JS node grammar mappings; core intra-procedural sequence solver and inverted deeplink index custom designed and verified by team.</w:t>
+        <w:t xml:space="preserve">  Details: AI helped with JS grammar node mappings. Core sequence-order solver designed and verified by team.</w:t>
         <w:br/>
       </w:r>
     </w:p>
@@ -357,15 +357,15 @@
         <w:rPr>
           <w:b/>
         </w:rPr>
-        <w:t>• Feature: Hybrid Subword Vector &amp; Lexical Engine</w:t>
+        <w:t>• Hybrid Subword Retrieval</w:t>
         <w:br/>
       </w:r>
       <w:r>
-        <w:t xml:space="preserve">  Origin: Both (Collaborative)</w:t>
+        <w:t xml:space="preserve">  Origin: Both (team + AI)</w:t>
         <w:br/>
       </w:r>
       <w:r>
-        <w:t xml:space="preserve">  Description: Scikit-learn TF-IDF setup assisted by AI; CamelCase/snake_case sub-token splitting and concept coverage ranking implemented by team for CPU optimization.</w:t>
+        <w:t xml:space="preserve">  Details: TF-IDF setup assisted by AI. CamelCase/snake_case tokenisation and concept-coverage ranking by team.</w:t>
         <w:br/>
       </w:r>
     </w:p>
@@ -374,15 +374,15 @@
         <w:rPr>
           <w:b/>
         </w:rPr>
-        <w:t>• Feature: CodePath Optimizer (Serial Await Waterfalls)</w:t>
+        <w:t>• CodePath Optimizer</w:t>
         <w:br/>
       </w:r>
       <w:r>
-        <w:t xml:space="preserve">  Origin: Self-Generated</w:t>
+        <w:t xml:space="preserve">  Origin: Team (original)</w:t>
         <w:br/>
       </w:r>
       <w:r>
-        <w:t xml:space="preserve">  Description: Original conceptual innovation by team to detect voice assistant latency bottlenecks and output automated Promise.all parallelization diffs.</w:t>
+        <w:t xml:space="preserve">  Details: Original idea — detects serial await waterfalls and outputs Promise.all diffs.</w:t>
         <w:br/>
       </w:r>
     </w:p>
@@ -391,15 +391,15 @@
         <w:rPr>
           <w:b/>
         </w:rPr>
-        <w:t>• Feature: ReAct Agent Controller (Plan-Search-Read-Refine)</w:t>
+        <w:t>• ReAct Agent Controller</w:t>
         <w:br/>
       </w:r>
       <w:r>
-        <w:t xml:space="preserve">  Origin: Both (Collaborative)</w:t>
+        <w:t xml:space="preserve">  Origin: Both (team + AI)</w:t>
         <w:br/>
       </w:r>
       <w:r>
-        <w:t xml:space="preserve">  Description: ReAct agent state machine designed collaboratively; intent classification regexes and confidence scoring refined by team.</w:t>
+        <w:t xml:space="preserve">  Details: State machine designed collaboratively; intent classification refined by team.</w:t>
         <w:br/>
       </w:r>
     </w:p>
@@ -408,15 +408,15 @@
         <w:rPr>
           <w:b/>
         </w:rPr>
-        <w:t>• Feature: Interactive Web Dashboard &amp; SVG Graph</w:t>
+        <w:t>• Web Dashboard</w:t>
         <w:br/>
       </w:r>
       <w:r>
-        <w:t xml:space="preserve">  Origin: Both (Collaborative)</w:t>
+        <w:t xml:space="preserve">  Origin: Both (team + AI)</w:t>
         <w:br/>
       </w:r>
       <w:r>
-        <w:t xml:space="preserve">  Description: Modern dark glassmorphic styling and layout assisted by AI; live backend API hooks and diff viewer verified by team.</w:t>
+        <w:t xml:space="preserve">  Details: Layout assisted by AI; live API hooks and graph renderer verified by team.</w:t>
         <w:br/>
       </w:r>
     </w:p>

</xml_diff>